<commit_message>
Use five teaching organization sections
</commit_message>
<xml_diff>
--- a/templates/lesson_plan_template.docx
+++ b/templates/lesson_plan_template.docx
@@ -973,49 +973,7 @@
                 <w:b/>
                 <w:sz w:val="24"/>
               </w:rPr>
-              <w:t>五、课堂练习/互动</w:t>
-            </w:r>
-          </w:p>
-          <w:p>
-            <w:pPr>
-              <w:tabs>
-                <w:tab w:val="left" w:pos="7080"/>
-              </w:tabs>
-              <w:spacing w:before="240" w:line="360" w:lineRule="exact"/>
-              <w:rPr>
-                <w:rFonts w:ascii="宋体" w:hAnsi="宋体" w:hint="eastAsia"/>
-                <w:b/>
-                <w:sz w:val="24"/>
-              </w:rPr>
-            </w:pPr>
-            <w:r>
-              <w:rPr>
-                <w:rFonts w:ascii="宋体" w:hAnsi="宋体" w:hint="eastAsia"/>
-                <w:b/>
-                <w:sz w:val="24"/>
-              </w:rPr>
-              <w:t>{{org_practice_interaction}}</w:t>
-            </w:r>
-          </w:p>
-          <w:p>
-            <w:pPr>
-              <w:tabs>
-                <w:tab w:val="left" w:pos="7080"/>
-              </w:tabs>
-              <w:spacing w:before="240" w:line="360" w:lineRule="exact"/>
-              <w:rPr>
-                <w:rFonts w:ascii="宋体" w:hAnsi="宋体" w:hint="eastAsia"/>
-                <w:b/>
-                <w:sz w:val="24"/>
-              </w:rPr>
-            </w:pPr>
-            <w:r>
-              <w:rPr>
-                <w:rFonts w:ascii="宋体" w:hAnsi="宋体" w:hint="eastAsia"/>
-                <w:b/>
-                <w:sz w:val="24"/>
-              </w:rPr>
-              <w:t>六、小结</w:t>
+              <w:t>五、小结</w:t>
             </w:r>
           </w:p>
           <w:p>

</xml_diff>